<commit_message>
Improve Hawk Console task editor and expand beginner guides
- Compact task description, argument schema, and execution controls
- Use a 40/60 description/schema layout and keep chat Send visible
- Position task creation buttons at the bottom of the form
- Prefill the empty-object argument schema for new task versions
- Document General Task creation, input schemas, defaults, and validation
- Explain the shared creation process for Collectors, Remediation, and Rollback Tasks
- Add a ChatGPT custom collector guide with prompts and Web UI/Console steps
- Link the new guide from README and related collector documentation
</commit_message>
<xml_diff>
--- a/Howto_Guides/LogHawk_Web_UI_Beginners_Guide.docx
+++ b/Howto_Guides/LogHawk_Web_UI_Beginners_Guide.docx
@@ -1366,7 +1366,1059 @@
         <w:pStyle w:val="Heading2"/>
       </w:pPr>
       <w:r>
+        <w:t>How to create a General Task</w:t>
+      </w:r>
+    </w:p>
+    <w:p>
+      <w:pPr>
+        <w:spacing w:after="120"/>
+      </w:pPr>
+      <w:r>
+        <w:t>This walkthrough creates a Python General Task called greeting. It prints the received arguments and Good morning! without changing an external system. You will first save a task that accepts no arguments, then learn how to add an optional or required name argument. Creating or saving the task does not run the program.</w:t>
+      </w:r>
+    </w:p>
+    <w:p>
+      <w:pPr>
+        <w:pStyle w:val="Heading3"/>
+      </w:pPr>
+      <w:r>
+        <w:t>Create the task in the Web UI</w:t>
+      </w:r>
+    </w:p>
+    <w:p>
+      <w:pPr>
+        <w:spacing w:after="120"/>
+      </w:pPr>
+      <w:r>
+        <w:t>1. Sign in and open Tasks &amp; Collectors &gt; Create Task. Enter greeting as the Task name, select Python as the artifact type and General Task as the Task kind. Use category GENERAL and description Prints a morning greeting and displays the received arguments. Keep Execution Policy as Manual.</w:t>
+      </w:r>
+    </w:p>
+    <w:p>
+      <w:pPr>
+        <w:spacing w:after="120"/>
+      </w:pPr>
+      <w:r>
+        <w:t>2. Create the task and open its editable workspace. Paste the complete Python code below into the code editor. You can also use task chat to draft code, but review the editor contents before saving.</w:t>
+      </w:r>
+    </w:p>
+    <w:p>
+      <w:pPr>
+        <w:spacing w:after="0"/>
+      </w:pPr>
+      <w:r>
+        <w:rPr>
+          <w:rFonts w:ascii="Consolas" w:hAnsi="Consolas"/>
+          <w:sz w:val="20"/>
+        </w:rPr>
+        <w:t>import os</w:t>
+      </w:r>
+    </w:p>
+    <w:p>
+      <w:pPr>
+        <w:spacing w:after="0"/>
+      </w:pPr>
+      <w:r>
+        <w:rPr>
+          <w:rFonts w:ascii="Consolas" w:hAnsi="Consolas"/>
+          <w:sz w:val="20"/>
+        </w:rPr>
+        <w:t>import json</w:t>
+      </w:r>
+    </w:p>
+    <w:p>
+      <w:pPr>
+        <w:spacing w:after="0"/>
+      </w:pPr>
+    </w:p>
+    <w:p>
+      <w:pPr>
+        <w:spacing w:after="0"/>
+      </w:pPr>
+      <w:r>
+        <w:rPr>
+          <w:rFonts w:ascii="Consolas" w:hAnsi="Consolas"/>
+          <w:sz w:val="20"/>
+        </w:rPr>
+        <w:t>def greet_user():</w:t>
+      </w:r>
+    </w:p>
+    <w:p>
+      <w:pPr>
+        <w:spacing w:after="0"/>
+      </w:pPr>
+      <w:r>
+        <w:rPr>
+          <w:rFonts w:ascii="Consolas" w:hAnsi="Consolas"/>
+          <w:sz w:val="20"/>
+        </w:rPr>
+        <w:t xml:space="preserve">    arguments = json.loads(</w:t>
+      </w:r>
+    </w:p>
+    <w:p>
+      <w:pPr>
+        <w:spacing w:after="0"/>
+      </w:pPr>
+      <w:r>
+        <w:rPr>
+          <w:rFonts w:ascii="Consolas" w:hAnsi="Consolas"/>
+          <w:sz w:val="20"/>
+        </w:rPr>
+        <w:t xml:space="preserve">            os.environ.get("LH_RUNNER_ARGUMENTS_JSON", "{}")</w:t>
+      </w:r>
+    </w:p>
+    <w:p>
+      <w:pPr>
+        <w:spacing w:after="0"/>
+      </w:pPr>
+      <w:r>
+        <w:rPr>
+          <w:rFonts w:ascii="Consolas" w:hAnsi="Consolas"/>
+          <w:sz w:val="20"/>
+        </w:rPr>
+        <w:t xml:space="preserve">        )</w:t>
+      </w:r>
+    </w:p>
+    <w:p>
+      <w:pPr>
+        <w:spacing w:after="0"/>
+      </w:pPr>
+      <w:r>
+        <w:rPr>
+          <w:rFonts w:ascii="Consolas" w:hAnsi="Consolas"/>
+          <w:sz w:val="20"/>
+        </w:rPr>
+        <w:t xml:space="preserve">    print("Arguments", arguments)</w:t>
+      </w:r>
+    </w:p>
+    <w:p>
+      <w:pPr>
+        <w:spacing w:after="0"/>
+      </w:pPr>
+      <w:r>
+        <w:rPr>
+          <w:rFonts w:ascii="Consolas" w:hAnsi="Consolas"/>
+          <w:sz w:val="20"/>
+        </w:rPr>
+        <w:t xml:space="preserve">    print('Good morning!')</w:t>
+      </w:r>
+    </w:p>
+    <w:p>
+      <w:pPr>
+        <w:spacing w:after="0"/>
+      </w:pPr>
+    </w:p>
+    <w:p>
+      <w:pPr>
+        <w:spacing w:after="0"/>
+      </w:pPr>
+      <w:r>
+        <w:rPr>
+          <w:rFonts w:ascii="Consolas" w:hAnsi="Consolas"/>
+          <w:sz w:val="20"/>
+        </w:rPr>
+        <w:t>if __name__ == '__main__':</w:t>
+      </w:r>
+    </w:p>
+    <w:p>
+      <w:pPr>
+        <w:spacing w:after="0"/>
+      </w:pPr>
+      <w:r>
+        <w:rPr>
+          <w:rFonts w:ascii="Consolas" w:hAnsi="Consolas"/>
+          <w:sz w:val="20"/>
+        </w:rPr>
+        <w:t xml:space="preserve">    greet_user()</w:t>
+      </w:r>
+    </w:p>
+    <w:p>
+      <w:pPr>
+        <w:spacing w:after="120"/>
+      </w:pPr>
+      <w:r>
+        <w:t>3. In Arguments schema JSON, enter the following schema. It accepts an empty JSON object and no named inputs.</w:t>
+      </w:r>
+    </w:p>
+    <w:p>
+      <w:pPr>
+        <w:spacing w:after="0"/>
+      </w:pPr>
+      <w:r>
+        <w:rPr>
+          <w:rFonts w:ascii="Consolas" w:hAnsi="Consolas"/>
+          <w:sz w:val="20"/>
+        </w:rPr>
+        <w:t>{</w:t>
+      </w:r>
+    </w:p>
+    <w:p>
+      <w:pPr>
+        <w:spacing w:after="0"/>
+      </w:pPr>
+      <w:r>
+        <w:rPr>
+          <w:rFonts w:ascii="Consolas" w:hAnsi="Consolas"/>
+          <w:sz w:val="20"/>
+        </w:rPr>
+        <w:t xml:space="preserve">  "additionalProperties": false,</w:t>
+      </w:r>
+    </w:p>
+    <w:p>
+      <w:pPr>
+        <w:spacing w:after="0"/>
+      </w:pPr>
+      <w:r>
+        <w:rPr>
+          <w:rFonts w:ascii="Consolas" w:hAnsi="Consolas"/>
+          <w:sz w:val="20"/>
+        </w:rPr>
+        <w:t xml:space="preserve">  "properties": {},</w:t>
+      </w:r>
+    </w:p>
+    <w:p>
+      <w:pPr>
+        <w:spacing w:after="0"/>
+      </w:pPr>
+      <w:r>
+        <w:rPr>
+          <w:rFonts w:ascii="Consolas" w:hAnsi="Consolas"/>
+          <w:sz w:val="20"/>
+        </w:rPr>
+        <w:t xml:space="preserve">  "required": [],</w:t>
+      </w:r>
+    </w:p>
+    <w:p>
+      <w:pPr>
+        <w:spacing w:after="0"/>
+      </w:pPr>
+      <w:r>
+        <w:rPr>
+          <w:rFonts w:ascii="Consolas" w:hAnsi="Consolas"/>
+          <w:sz w:val="20"/>
+        </w:rPr>
+        <w:t xml:space="preserve">  "type": "object"</w:t>
+      </w:r>
+    </w:p>
+    <w:p>
+      <w:pPr>
+        <w:spacing w:after="0"/>
+      </w:pPr>
+      <w:r>
+        <w:rPr>
+          <w:rFonts w:ascii="Consolas" w:hAnsi="Consolas"/>
+          <w:sz w:val="20"/>
+        </w:rPr>
+        <w:t>}</w:t>
+      </w:r>
+    </w:p>
+    <w:p>
+      <w:pPr>
+        <w:spacing w:after="120"/>
+      </w:pPr>
+      <w:r>
+        <w:t>4. Click Save Version. LogHawk checks Python syntax and the argument schema. The saved version contains both code and schema. A syntax check does not prove that the program will work correctly at runtime.</w:t>
+      </w:r>
+    </w:p>
+    <w:p>
+      <w:pPr>
+        <w:pStyle w:val="Heading3"/>
+      </w:pPr>
+      <w:r>
+        <w:t>Test the saved task</w:t>
+      </w:r>
+    </w:p>
+    <w:p>
+      <w:pPr>
+        <w:spacing w:after="120"/>
+      </w:pPr>
+      <w:r>
+        <w:t>Open signed-in Hawk Console to access the same server task, then enter this in Command Terminal 1 or 2. hawk --local has a separate task database and will not automatically find the task created in Web UI.</w:t>
+      </w:r>
+    </w:p>
+    <w:p>
+      <w:pPr>
+        <w:spacing w:after="0"/>
+      </w:pPr>
+      <w:r>
+        <w:rPr>
+          <w:rFonts w:ascii="Consolas" w:hAnsi="Consolas"/>
+          <w:sz w:val="20"/>
+        </w:rPr>
+        <w:t>/taskrun greeting {}</w:t>
+      </w:r>
+    </w:p>
+    <w:p>
+      <w:pPr>
+        <w:spacing w:after="120"/>
+      </w:pPr>
+      <w:r>
+        <w:t>Review the displayed code and answer Y or y at the local execution prompt. This development command runs on the Console computer without requiring approval or enablement. Python uses that computer’s venv_tools. Expected program output:</w:t>
+      </w:r>
+    </w:p>
+    <w:p>
+      <w:pPr>
+        <w:spacing w:after="0"/>
+      </w:pPr>
+      <w:r>
+        <w:rPr>
+          <w:rFonts w:ascii="Consolas" w:hAnsi="Consolas"/>
+          <w:sz w:val="20"/>
+        </w:rPr>
+        <w:t>Arguments {}</w:t>
+      </w:r>
+    </w:p>
+    <w:p>
+      <w:pPr>
+        <w:spacing w:after="0"/>
+      </w:pPr>
+      <w:r>
+        <w:rPr>
+          <w:rFonts w:ascii="Consolas" w:hAnsi="Consolas"/>
+          <w:sz w:val="20"/>
+        </w:rPr>
+        <w:t>Good morning!</w:t>
+      </w:r>
+    </w:p>
+    <w:p>
+      <w:pPr>
+        <w:spacing w:after="120"/>
+      </w:pPr>
+      <w:r>
+        <w:t>The Console also reports the task exit code. Exit code 0 means the process completed successfully. This is expected output for the example, not a record of a test performed while writing this guide.</w:t>
+      </w:r>
+    </w:p>
+    <w:p>
+      <w:pPr>
+        <w:spacing w:after="120"/>
+      </w:pPr>
+      <w:r>
+        <w:t>For API execution, select the saved version in the task workspace and enable it; an Administrator or Power User must approve it. Users can enable versions but cannot approve them. All roles, including Administrator, require an enabled and approved version for API execution. In signed-in Console, /task greeting {} then executes on the API host. Manual policy permits human-initiated API execution; it does not mean a second Y/N prompt is added to that API command.</w:t>
+      </w:r>
+    </w:p>
+    <w:p>
+      <w:pPr>
+        <w:spacing w:after="120"/>
+      </w:pPr>
+      <w:r>
+        <w:t>This example prints plain text, so its API result includes data.text containing the printed lines. Captured stdout and execution metadata are retained. It does not return structured JSON simply because the input arguments were JSON.</w:t>
+      </w:r>
+    </w:p>
+    <w:p>
+      <w:pPr>
+        <w:pStyle w:val="Heading3"/>
+      </w:pPr>
+      <w:r>
+        <w:t>Argument values and argument schema are different</w:t>
+      </w:r>
+    </w:p>
+    <w:p>
+      <w:pPr>
+        <w:spacing w:after="120"/>
+      </w:pPr>
+      <w:r>
+        <w:t>Argument JSON contains the values for one run, such as {"name":"Anees"}. The argument schema defines which values the saved version accepts: field names, types, required fields, defaults and bounds. Paste the schema in Arguments schema JSON; pass the actual values when running the task. Do not pass the schema itself as runtime arguments.</w:t>
+      </w:r>
+    </w:p>
+    <w:p>
+      <w:pPr>
+        <w:spacing w:after="120"/>
+      </w:pPr>
+      <w:r>
+        <w:t>JSON uses double quotes around property names and string values. Its booleans are true and false, and its null value is null. JSON does not allow Python-style single-quoted strings, True, False, comments or trailing commas. The top-level arguments for a task must be an object, such as {}, rather than an array or a plain string.</w:t>
+      </w:r>
+    </w:p>
+    <w:p>
+      <w:pPr>
+        <w:pStyle w:val="Heading3"/>
+      </w:pPr>
+      <w:r>
+        <w:t>Understand every part of the empty schema</w:t>
+      </w:r>
+    </w:p>
+    <w:p>
+      <w:pPr>
+        <w:spacing w:after="120"/>
+      </w:pPr>
+      <w:r>
+        <w:t>"type": "object" means the runtime input must be a JSON object. "properties": {} declares no named fields. "required": [] is an empty list of mandatory field names. "additionalProperties": false rejects fields that have not been declared under properties.</w:t>
+      </w:r>
+    </w:p>
+    <w:p>
+      <w:pPr>
+        <w:spacing w:after="120"/>
+      </w:pPr>
+      <w:r>
+        <w:t>Together these four rules accept {} and reject {"name":"Anees"}. They also reject [] and "hello" because those values are not objects. An empty required list alone does not mean that arguments are prohibited; the combination of no declared properties and additionalProperties false prohibits them.</w:t>
+      </w:r>
+    </w:p>
+    <w:p>
+      <w:pPr>
+        <w:spacing w:after="120"/>
+      </w:pPr>
+      <w:r>
+        <w:t>In LogHawk, leaving the schema blank or entering {} in the schema editor is normalized to an explicit empty-object schema when saved. That is a LogHawk convention. Do not interpret a blank schema as permission to supply arbitrary arguments. Existing saved versions retain their schemas until a new version is saved.</w:t>
+      </w:r>
+    </w:p>
+    <w:p>
+      <w:pPr>
+        <w:pStyle w:val="Heading3"/>
+      </w:pPr>
+      <w:r>
+        <w:t>Add an optional argument with a default</w:t>
+      </w:r>
+    </w:p>
+    <w:p>
+      <w:pPr>
+        <w:spacing w:after="120"/>
+      </w:pPr>
+      <w:r>
+        <w:t>To allow an optional name, replace the schema with this example. The schema default is World. The field has a non-empty string constraint and a maximum length of 80 characters.</w:t>
+      </w:r>
+    </w:p>
+    <w:p>
+      <w:pPr>
+        <w:spacing w:after="0"/>
+      </w:pPr>
+      <w:r>
+        <w:rPr>
+          <w:rFonts w:ascii="Consolas" w:hAnsi="Consolas"/>
+          <w:sz w:val="20"/>
+        </w:rPr>
+        <w:t>{</w:t>
+      </w:r>
+    </w:p>
+    <w:p>
+      <w:pPr>
+        <w:spacing w:after="0"/>
+      </w:pPr>
+      <w:r>
+        <w:rPr>
+          <w:rFonts w:ascii="Consolas" w:hAnsi="Consolas"/>
+          <w:sz w:val="20"/>
+        </w:rPr>
+        <w:t xml:space="preserve">  "type": "object",</w:t>
+      </w:r>
+    </w:p>
+    <w:p>
+      <w:pPr>
+        <w:spacing w:after="0"/>
+      </w:pPr>
+      <w:r>
+        <w:rPr>
+          <w:rFonts w:ascii="Consolas" w:hAnsi="Consolas"/>
+          <w:sz w:val="20"/>
+        </w:rPr>
+        <w:t xml:space="preserve">  "properties": {</w:t>
+      </w:r>
+    </w:p>
+    <w:p>
+      <w:pPr>
+        <w:spacing w:after="0"/>
+      </w:pPr>
+      <w:r>
+        <w:rPr>
+          <w:rFonts w:ascii="Consolas" w:hAnsi="Consolas"/>
+          <w:sz w:val="20"/>
+        </w:rPr>
+        <w:t xml:space="preserve">    "name": {</w:t>
+      </w:r>
+    </w:p>
+    <w:p>
+      <w:pPr>
+        <w:spacing w:after="0"/>
+      </w:pPr>
+      <w:r>
+        <w:rPr>
+          <w:rFonts w:ascii="Consolas" w:hAnsi="Consolas"/>
+          <w:sz w:val="20"/>
+        </w:rPr>
+        <w:t xml:space="preserve">      "type": "string",</w:t>
+      </w:r>
+    </w:p>
+    <w:p>
+      <w:pPr>
+        <w:spacing w:after="0"/>
+      </w:pPr>
+      <w:r>
+        <w:rPr>
+          <w:rFonts w:ascii="Consolas" w:hAnsi="Consolas"/>
+          <w:sz w:val="20"/>
+        </w:rPr>
+        <w:t xml:space="preserve">      "description": "Name to include in the greeting.",</w:t>
+      </w:r>
+    </w:p>
+    <w:p>
+      <w:pPr>
+        <w:spacing w:after="0"/>
+      </w:pPr>
+      <w:r>
+        <w:rPr>
+          <w:rFonts w:ascii="Consolas" w:hAnsi="Consolas"/>
+          <w:sz w:val="20"/>
+        </w:rPr>
+        <w:t xml:space="preserve">      "default": "World",</w:t>
+      </w:r>
+    </w:p>
+    <w:p>
+      <w:pPr>
+        <w:spacing w:after="0"/>
+      </w:pPr>
+      <w:r>
+        <w:rPr>
+          <w:rFonts w:ascii="Consolas" w:hAnsi="Consolas"/>
+          <w:sz w:val="20"/>
+        </w:rPr>
+        <w:t xml:space="preserve">      "minLength": 1,</w:t>
+      </w:r>
+    </w:p>
+    <w:p>
+      <w:pPr>
+        <w:spacing w:after="0"/>
+      </w:pPr>
+      <w:r>
+        <w:rPr>
+          <w:rFonts w:ascii="Consolas" w:hAnsi="Consolas"/>
+          <w:sz w:val="20"/>
+        </w:rPr>
+        <w:t xml:space="preserve">      "maxLength": 80</w:t>
+      </w:r>
+    </w:p>
+    <w:p>
+      <w:pPr>
+        <w:spacing w:after="0"/>
+      </w:pPr>
+      <w:r>
+        <w:rPr>
+          <w:rFonts w:ascii="Consolas" w:hAnsi="Consolas"/>
+          <w:sz w:val="20"/>
+        </w:rPr>
+        <w:t xml:space="preserve">    }</w:t>
+      </w:r>
+    </w:p>
+    <w:p>
+      <w:pPr>
+        <w:spacing w:after="0"/>
+      </w:pPr>
+      <w:r>
+        <w:rPr>
+          <w:rFonts w:ascii="Consolas" w:hAnsi="Consolas"/>
+          <w:sz w:val="20"/>
+        </w:rPr>
+        <w:t xml:space="preserve">  },</w:t>
+      </w:r>
+    </w:p>
+    <w:p>
+      <w:pPr>
+        <w:spacing w:after="0"/>
+      </w:pPr>
+      <w:r>
+        <w:rPr>
+          <w:rFonts w:ascii="Consolas" w:hAnsi="Consolas"/>
+          <w:sz w:val="20"/>
+        </w:rPr>
+        <w:t xml:space="preserve">  "required": [],</w:t>
+      </w:r>
+    </w:p>
+    <w:p>
+      <w:pPr>
+        <w:spacing w:after="0"/>
+      </w:pPr>
+      <w:r>
+        <w:rPr>
+          <w:rFonts w:ascii="Consolas" w:hAnsi="Consolas"/>
+          <w:sz w:val="20"/>
+        </w:rPr>
+        <w:t xml:space="preserve">  "additionalProperties": false</w:t>
+      </w:r>
+    </w:p>
+    <w:p>
+      <w:pPr>
+        <w:spacing w:after="0"/>
+      </w:pPr>
+      <w:r>
+        <w:rPr>
+          <w:rFonts w:ascii="Consolas" w:hAnsi="Consolas"/>
+          <w:sz w:val="20"/>
+        </w:rPr>
+        <w:t>}</w:t>
+      </w:r>
+    </w:p>
+    <w:p>
+      <w:pPr>
+        <w:spacing w:after="120"/>
+      </w:pPr>
+      <w:r>
+        <w:t>Replace the code with the following parameterized program and Save Version. It reads the supplied name; the Python fallback also makes it useful when run directly outside LogHawk.</w:t>
+      </w:r>
+    </w:p>
+    <w:p>
+      <w:pPr>
+        <w:spacing w:after="0"/>
+      </w:pPr>
+      <w:r>
+        <w:rPr>
+          <w:rFonts w:ascii="Consolas" w:hAnsi="Consolas"/>
+          <w:sz w:val="20"/>
+        </w:rPr>
+        <w:t>import json</w:t>
+      </w:r>
+    </w:p>
+    <w:p>
+      <w:pPr>
+        <w:spacing w:after="0"/>
+      </w:pPr>
+      <w:r>
+        <w:rPr>
+          <w:rFonts w:ascii="Consolas" w:hAnsi="Consolas"/>
+          <w:sz w:val="20"/>
+        </w:rPr>
+        <w:t>import os</w:t>
+      </w:r>
+    </w:p>
+    <w:p>
+      <w:pPr>
+        <w:spacing w:after="0"/>
+      </w:pPr>
+    </w:p>
+    <w:p>
+      <w:pPr>
+        <w:spacing w:after="0"/>
+      </w:pPr>
+    </w:p>
+    <w:p>
+      <w:pPr>
+        <w:spacing w:after="0"/>
+      </w:pPr>
+      <w:r>
+        <w:rPr>
+          <w:rFonts w:ascii="Consolas" w:hAnsi="Consolas"/>
+          <w:sz w:val="20"/>
+        </w:rPr>
+        <w:t>def greet_user():</w:t>
+      </w:r>
+    </w:p>
+    <w:p>
+      <w:pPr>
+        <w:spacing w:after="0"/>
+      </w:pPr>
+      <w:r>
+        <w:rPr>
+          <w:rFonts w:ascii="Consolas" w:hAnsi="Consolas"/>
+          <w:sz w:val="20"/>
+        </w:rPr>
+        <w:t xml:space="preserve">    arguments = json.loads(</w:t>
+      </w:r>
+    </w:p>
+    <w:p>
+      <w:pPr>
+        <w:spacing w:after="0"/>
+      </w:pPr>
+      <w:r>
+        <w:rPr>
+          <w:rFonts w:ascii="Consolas" w:hAnsi="Consolas"/>
+          <w:sz w:val="20"/>
+        </w:rPr>
+        <w:t xml:space="preserve">        os.environ.get("LH_RUNNER_ARGUMENTS_JSON", "{}")</w:t>
+      </w:r>
+    </w:p>
+    <w:p>
+      <w:pPr>
+        <w:spacing w:after="0"/>
+      </w:pPr>
+      <w:r>
+        <w:rPr>
+          <w:rFonts w:ascii="Consolas" w:hAnsi="Consolas"/>
+          <w:sz w:val="20"/>
+        </w:rPr>
+        <w:t xml:space="preserve">    )</w:t>
+      </w:r>
+    </w:p>
+    <w:p>
+      <w:pPr>
+        <w:spacing w:after="0"/>
+      </w:pPr>
+      <w:r>
+        <w:rPr>
+          <w:rFonts w:ascii="Consolas" w:hAnsi="Consolas"/>
+          <w:sz w:val="20"/>
+        </w:rPr>
+        <w:t xml:space="preserve">    name = arguments.get("name", "World")</w:t>
+      </w:r>
+    </w:p>
+    <w:p>
+      <w:pPr>
+        <w:spacing w:after="0"/>
+      </w:pPr>
+      <w:r>
+        <w:rPr>
+          <w:rFonts w:ascii="Consolas" w:hAnsi="Consolas"/>
+          <w:sz w:val="20"/>
+        </w:rPr>
+        <w:t xml:space="preserve">    print("Arguments", arguments)</w:t>
+      </w:r>
+    </w:p>
+    <w:p>
+      <w:pPr>
+        <w:spacing w:after="0"/>
+      </w:pPr>
+      <w:r>
+        <w:rPr>
+          <w:rFonts w:ascii="Consolas" w:hAnsi="Consolas"/>
+          <w:sz w:val="20"/>
+        </w:rPr>
+        <w:t xml:space="preserve">    print(f"Good morning, {name}!")</w:t>
+      </w:r>
+    </w:p>
+    <w:p>
+      <w:pPr>
+        <w:spacing w:after="0"/>
+      </w:pPr>
+    </w:p>
+    <w:p>
+      <w:pPr>
+        <w:spacing w:after="0"/>
+      </w:pPr>
+    </w:p>
+    <w:p>
+      <w:pPr>
+        <w:spacing w:after="0"/>
+      </w:pPr>
+      <w:r>
+        <w:rPr>
+          <w:rFonts w:ascii="Consolas" w:hAnsi="Consolas"/>
+          <w:sz w:val="20"/>
+        </w:rPr>
+        <w:t>if __name__ == "__main__":</w:t>
+      </w:r>
+    </w:p>
+    <w:p>
+      <w:pPr>
+        <w:spacing w:after="0"/>
+      </w:pPr>
+      <w:r>
+        <w:rPr>
+          <w:rFonts w:ascii="Consolas" w:hAnsi="Consolas"/>
+          <w:sz w:val="20"/>
+        </w:rPr>
+        <w:t xml:space="preserve">    greet_user()</w:t>
+      </w:r>
+    </w:p>
+    <w:p>
+      <w:pPr>
+        <w:spacing w:after="120"/>
+      </w:pPr>
+      <w:r>
+        <w:t>With the saved optional-name schema, run /taskrun greeting {} to receive Good morning, World! The validator inserts the missing name default before execution. Run /taskrun greeting {"name":"Anees"} to receive Good morning, Anees! The Arguments line displays the resulting Python dictionary, so it may show single quotes even though the original runtime input was JSON.</w:t>
+      </w:r>
+    </w:p>
+    <w:p>
+      <w:pPr>
+        <w:spacing w:after="120"/>
+      </w:pPr>
+      <w:r>
+        <w:t>{"name":null} is invalid because null is a supplied value and the schema requires a string; the default does not replace it. {"name":""} fails minLength. {"name":42} fails the string type check. {"name":"Anees","extra":true} fails additionalProperties. A string containing only spaces can satisfy minLength; add an explicit strip/validation check inside your program if that should be rejected.</w:t>
+      </w:r>
+    </w:p>
+    <w:p>
+      <w:pPr>
+        <w:pStyle w:val="Heading3"/>
+      </w:pPr>
+      <w:r>
+        <w:t>Make an argument required</w:t>
+      </w:r>
+    </w:p>
+    <w:p>
+      <w:pPr>
+        <w:spacing w:after="120"/>
+      </w:pPr>
+      <w:r>
+        <w:t>To require callers to supply name, use the following schema. Notice that the default is removed and name is included in required.</w:t>
+      </w:r>
+    </w:p>
+    <w:p>
+      <w:pPr>
+        <w:spacing w:after="0"/>
+      </w:pPr>
+      <w:r>
+        <w:rPr>
+          <w:rFonts w:ascii="Consolas" w:hAnsi="Consolas"/>
+          <w:sz w:val="20"/>
+        </w:rPr>
+        <w:t>{</w:t>
+      </w:r>
+    </w:p>
+    <w:p>
+      <w:pPr>
+        <w:spacing w:after="0"/>
+      </w:pPr>
+      <w:r>
+        <w:rPr>
+          <w:rFonts w:ascii="Consolas" w:hAnsi="Consolas"/>
+          <w:sz w:val="20"/>
+        </w:rPr>
+        <w:t xml:space="preserve">  "type": "object",</w:t>
+      </w:r>
+    </w:p>
+    <w:p>
+      <w:pPr>
+        <w:spacing w:after="0"/>
+      </w:pPr>
+      <w:r>
+        <w:rPr>
+          <w:rFonts w:ascii="Consolas" w:hAnsi="Consolas"/>
+          <w:sz w:val="20"/>
+        </w:rPr>
+        <w:t xml:space="preserve">  "properties": {</w:t>
+      </w:r>
+    </w:p>
+    <w:p>
+      <w:pPr>
+        <w:spacing w:after="0"/>
+      </w:pPr>
+      <w:r>
+        <w:rPr>
+          <w:rFonts w:ascii="Consolas" w:hAnsi="Consolas"/>
+          <w:sz w:val="20"/>
+        </w:rPr>
+        <w:t xml:space="preserve">    "name": {</w:t>
+      </w:r>
+    </w:p>
+    <w:p>
+      <w:pPr>
+        <w:spacing w:after="0"/>
+      </w:pPr>
+      <w:r>
+        <w:rPr>
+          <w:rFonts w:ascii="Consolas" w:hAnsi="Consolas"/>
+          <w:sz w:val="20"/>
+        </w:rPr>
+        <w:t xml:space="preserve">      "type": "string",</w:t>
+      </w:r>
+    </w:p>
+    <w:p>
+      <w:pPr>
+        <w:spacing w:after="0"/>
+      </w:pPr>
+      <w:r>
+        <w:rPr>
+          <w:rFonts w:ascii="Consolas" w:hAnsi="Consolas"/>
+          <w:sz w:val="20"/>
+        </w:rPr>
+        <w:t xml:space="preserve">      "minLength": 1,</w:t>
+      </w:r>
+    </w:p>
+    <w:p>
+      <w:pPr>
+        <w:spacing w:after="0"/>
+      </w:pPr>
+      <w:r>
+        <w:rPr>
+          <w:rFonts w:ascii="Consolas" w:hAnsi="Consolas"/>
+          <w:sz w:val="20"/>
+        </w:rPr>
+        <w:t xml:space="preserve">      "maxLength": 80</w:t>
+      </w:r>
+    </w:p>
+    <w:p>
+      <w:pPr>
+        <w:spacing w:after="0"/>
+      </w:pPr>
+      <w:r>
+        <w:rPr>
+          <w:rFonts w:ascii="Consolas" w:hAnsi="Consolas"/>
+          <w:sz w:val="20"/>
+        </w:rPr>
+        <w:t xml:space="preserve">    }</w:t>
+      </w:r>
+    </w:p>
+    <w:p>
+      <w:pPr>
+        <w:spacing w:after="0"/>
+      </w:pPr>
+      <w:r>
+        <w:rPr>
+          <w:rFonts w:ascii="Consolas" w:hAnsi="Consolas"/>
+          <w:sz w:val="20"/>
+        </w:rPr>
+        <w:t xml:space="preserve">  },</w:t>
+      </w:r>
+    </w:p>
+    <w:p>
+      <w:pPr>
+        <w:spacing w:after="0"/>
+      </w:pPr>
+      <w:r>
+        <w:rPr>
+          <w:rFonts w:ascii="Consolas" w:hAnsi="Consolas"/>
+          <w:sz w:val="20"/>
+        </w:rPr>
+        <w:t xml:space="preserve">  "required": ["name"],</w:t>
+      </w:r>
+    </w:p>
+    <w:p>
+      <w:pPr>
+        <w:spacing w:after="0"/>
+      </w:pPr>
+      <w:r>
+        <w:rPr>
+          <w:rFonts w:ascii="Consolas" w:hAnsi="Consolas"/>
+          <w:sz w:val="20"/>
+        </w:rPr>
+        <w:t xml:space="preserve">  "additionalProperties": false</w:t>
+      </w:r>
+    </w:p>
+    <w:p>
+      <w:pPr>
+        <w:spacing w:after="0"/>
+      </w:pPr>
+      <w:r>
+        <w:rPr>
+          <w:rFonts w:ascii="Consolas" w:hAnsi="Consolas"/>
+          <w:sz w:val="20"/>
+        </w:rPr>
+        <w:t>}</w:t>
+      </w:r>
+    </w:p>
+    <w:p>
+      <w:pPr>
+        <w:spacing w:after="120"/>
+      </w:pPr>
+      <w:r>
+        <w:t>With this schema, {} is rejected before execution; {"name":"Anees"} is accepted. required lists property names, not values or types, and every listed name must be declared in properties. In the current LogHawk validator, defaults are inserted before required fields are checked. Therefore a required field with a default can be filled automatically. Remove the default when your goal is to require an explicit caller value.</w:t>
+      </w:r>
+    </w:p>
+    <w:p>
+      <w:pPr>
+        <w:pStyle w:val="Heading3"/>
+      </w:pPr>
+      <w:r>
+        <w:t>Schema defaults and Python defaults</w:t>
+      </w:r>
+    </w:p>
+    <w:p>
+      <w:pPr>
+        <w:spacing w:after="120"/>
+      </w:pPr>
+      <w:r>
+        <w:t>A schema default is inserted by LogHawk validation before the script runs and becomes part of the validated argument object. arguments.get("name", "World") is a Python fallback used only after execution begins. It does not make an invalid request pass schema validation. A direct command-line run outside LogHawk does not automatically apply the saved schema; the program must then handle input validation and defaults itself.</w:t>
+      </w:r>
+    </w:p>
+    <w:p>
+      <w:pPr>
+        <w:spacing w:after="120"/>
+      </w:pPr>
+      <w:r>
+        <w:t>dict.get returns its fallback only when a key is absent. It does not replace an explicit None value. Inside LogHawk, the string schema rejects JSON null before execution. This is why optional, missing and null are different concepts.</w:t>
+      </w:r>
+    </w:p>
+    <w:p>
+      <w:pPr>
+        <w:pStyle w:val="Heading3"/>
+      </w:pPr>
+      <w:r>
+        <w:t>How arguments reach the program</w:t>
+      </w:r>
+    </w:p>
+    <w:p>
+      <w:pPr>
+        <w:spacing w:after="120"/>
+      </w:pPr>
+      <w:r>
+        <w:t>LogHawk validates the runtime object, applies schema defaults, serializes it as JSON and sets LH_RUNNER_ARGUMENTS_JSON in the child process environment. os.environ.get reads the string; json.loads converts it into a Python dictionary. Do not edit .env to change per-run arguments. Supply them with the execution request instead.</w:t>
+      </w:r>
+    </w:p>
+    <w:p>
+      <w:pPr>
+        <w:spacing w:after="120"/>
+      </w:pPr>
+      <w:r>
+        <w:t>Other settings and credentials come from the execution host’s .env_tools or existing process environment. Web UI and signed-in API execution use server-side settings; local /taskrun and /collectrun use local settings even when the Console is signed in. Keep credentials out of runtime examples and printed output. The raw task execution log can retain stdout/stderr before AI redaction.</w:t>
+      </w:r>
+    </w:p>
+    <w:p>
+      <w:pPr>
+        <w:pStyle w:val="Heading3"/>
+      </w:pPr>
+      <w:r>
+        <w:t>Save and approve the matching version</w:t>
+      </w:r>
+    </w:p>
+    <w:p>
+      <w:pPr>
+        <w:spacing w:after="120"/>
+      </w:pPr>
+      <w:r>
+        <w:t>Keep code and schema consistent: the no-argument script does not use name, whereas the parameterized script does. Save Version after changing code or schema. Saving changes creates a new immutable version instead of rewriting the selected older version, and that new version requires its own approval and enablement for API execution. Local development runs remain available for testing before approval. The schema describes accepted input; it does not grant execution permission.</w:t>
+      </w:r>
+    </w:p>
+    <w:p>
+      <w:pPr>
+        <w:pStyle w:val="Heading3"/>
+      </w:pPr>
+      <w:r>
+        <w:t>Creating other task kinds</w:t>
+      </w:r>
+    </w:p>
+    <w:p>
+      <w:pPr/>
+      <w:r>
+        <w:t>Collectors, Remediation Tasks, and Rollback Tasks follow the same creation process. Choose the corresponding Create Collector, Create Remediation Task, or Create Rollback Task link, or select the appropriate Task kind when creating a task.</w:t>
+      </w:r>
+    </w:p>
+    <w:p>
+      <w:pPr/>
+      <w:r>
+        <w:t>Enter its name, description, category, artifact type, execution policy, code, and argument schema, then click Save Version. The same argument validation, versioning, approval, and enablement rules apply.</w:t>
+      </w:r>
+    </w:p>
+    <w:p>
+      <w:pPr/>
+      <w:r>
+        <w:t>Choose the kind according to its purpose:</w:t>
+      </w:r>
+    </w:p>
+    <w:p>
+      <w:pPr>
+        <w:pStyle w:val="ListBullet"/>
+      </w:pPr>
+      <w:r>
+        <w:t>Collector: gathers operational evidence.</w:t>
+      </w:r>
+    </w:p>
+    <w:p>
+      <w:pPr>
+        <w:pStyle w:val="ListBullet"/>
+      </w:pPr>
+      <w:r>
+        <w:t>Remediation Task: performs a corrective action.</w:t>
+      </w:r>
+    </w:p>
+    <w:p>
+      <w:pPr>
+        <w:pStyle w:val="ListBullet"/>
+      </w:pPr>
+      <w:r>
+        <w:t>Rollback Task: reverses a change or restores a previous state.</w:t>
+      </w:r>
+    </w:p>
+    <w:p>
+      <w:pPr/>
+      <w:r>
+        <w:t>Sharing the creation process does not automatically make every task kind available to AI-assisted RCA. Its current discovery flow selects eligible Collectors.</w:t>
+      </w:r>
+    </w:p>
+    <w:p>
+      <w:pPr>
+        <w:pStyle w:val="Heading2"/>
+      </w:pPr>
+      <w:r>
         <w:t>Collectors</w:t>
+      </w:r>
+    </w:p>
+    <w:p>
+      <w:pPr/>
+      <w:r>
+        <w:t>For detailed steps, refer to “How to Create Custom Collectors” (How_to_Create_Custom_Collectors.docx) in the Howto_Guides folder. It includes complete code examples, argument schemas, local testing, approval and enablement, AI discovery, and troubleshooting.</w:t>
       </w:r>
     </w:p>
     <w:p>

</xml_diff>